<commit_message>
feat: portfolio rebrand (editorial-technical design) + resume finalization
Rebrand:
- New design-token system: neutral base + single indigo accent, light/dark
- Redesign Navbar, Footer, Hero, About, Contact, Projects, TechStack
- Add Vanta background and scroll-reveal (Reveal) components
- Add SEO/metadata routes: icon, opengraph-image, robots, sitemap
- Optimize project images (trulyhome, zaptime); extend icon exporter

Resume:
- Add TrulyHome (30-day build) and Zaptime as most-recent experience
- Trim an older Ariolas Tech bullet to hold a clean two pages
- Align resume accent to the new indigo (#2f54c8)
- Regenerate PDF and editable DOCX

Co-Authored-By: Claude Opus 4.8 <noreply@anthropic.com>
</commit_message>
<xml_diff>
--- a/public/pdf/Nicdao-Justine_Resume-Professional.docx
+++ b/public/pdf/Nicdao-Justine_Resume-Professional.docx
@@ -11,7 +11,7 @@
         <w:rPr>
           <w:b/>
           <w:bCs/>
-          <w:color w:val="1F3A5F"/>
+          <w:color w:val="2F54C8"/>
           <w:sz w:val="44"/>
           <w:szCs w:val="44"/>
         </w:rPr>
@@ -37,7 +37,7 @@
     <w:p>
       <w:pPr>
         <w:pBdr>
-          <w:bottom w:val="single" w:color="1F3A5F" w:sz="18" w:space="8"/>
+          <w:bottom w:val="single" w:color="2F54C8" w:sz="18" w:space="8"/>
         </w:pBdr>
         <w:spacing w:after="40"/>
         <w:jc w:val="center"/>
@@ -74,7 +74,7 @@
         </w:rPr>
         <w:t xml:space="preserve">   ·   </w:t>
       </w:r>
-      <w:hyperlink w:history="1" r:id="rIdt91dhrzpdkbcvgvyxpnqg">
+      <w:hyperlink w:history="1" r:id="rIdiesrkt0yqvs0h7kp5zkz8">
         <w:r>
           <w:rPr>
             <w:color w:val="4B5563"/>
@@ -92,7 +92,7 @@
         </w:rPr>
         <w:t xml:space="preserve">   ·   </w:t>
       </w:r>
-      <w:hyperlink w:history="1" r:id="rIdk653ls8o2zbqs1mcw3_d7">
+      <w:hyperlink w:history="1" r:id="rIdhzdkann22sn3jisoiavxd">
         <w:r>
           <w:rPr>
             <w:color w:val="4B5563"/>
@@ -116,7 +116,7 @@
           <w:b/>
           <w:bCs/>
           <w:caps/>
-          <w:color w:val="1F3A5F"/>
+          <w:color w:val="2F54C8"/>
           <w:spacing w:val="32"/>
           <w:sz w:val="22"/>
           <w:szCs w:val="22"/>
@@ -386,7 +386,7 @@
           <w:b/>
           <w:bCs/>
           <w:caps/>
-          <w:color w:val="1F3A5F"/>
+          <w:color w:val="2F54C8"/>
           <w:spacing w:val="32"/>
           <w:sz w:val="22"/>
           <w:szCs w:val="22"/>
@@ -410,7 +410,7 @@
           <w:sz w:val="23"/>
           <w:szCs w:val="23"/>
         </w:rPr>
-        <w:t xml:space="preserve">Full Stack Software Engineer</w:t>
+        <w:t xml:space="preserve">Full-Stack Developer</w:t>
       </w:r>
       <w:r>
         <w:rPr>
@@ -418,7 +418,7 @@
           <w:sz w:val="19"/>
           <w:szCs w:val="19"/>
         </w:rPr>
-        <w:t xml:space="preserve">	June 2025 – January 2026</w:t>
+        <w:t xml:space="preserve">	May 2026 – June 2026 · 30-day build</w:t>
       </w:r>
     </w:p>
     <w:p>
@@ -430,83 +430,65 @@
         <w:rPr>
           <w:b/>
           <w:bCs/>
-          <w:color w:val="1F3A5F"/>
-          <w:sz w:val="20"/>
-          <w:szCs w:val="20"/>
-        </w:rPr>
-        <w:t xml:space="preserve">Switch</w:t>
-      </w:r>
-    </w:p>
-    <w:p>
-      <w:pPr>
-        <w:pStyle w:val="ListParagraph"/>
-        <w:numPr>
-          <w:ilvl w:val="0"/>
-          <w:numId w:val="2"/>
-        </w:numPr>
-        <w:spacing w:after="50"/>
-      </w:pPr>
-      <w:r>
-        <w:rPr>
-          <w:color w:val="374151"/>
-          <w:sz w:val="20"/>
-          <w:szCs w:val="20"/>
-        </w:rPr>
-        <w:t xml:space="preserve">Built responsive, accessible UIs with Next.js 15 (App Router), React/TypeScript, TailwindCSS, and Shadcn/UI—turning designs into reusable, consistent components.</w:t>
-      </w:r>
-    </w:p>
-    <w:p>
-      <w:pPr>
-        <w:pStyle w:val="ListParagraph"/>
-        <w:numPr>
-          <w:ilvl w:val="0"/>
-          <w:numId w:val="2"/>
-        </w:numPr>
-        <w:spacing w:after="50"/>
-      </w:pPr>
-      <w:r>
-        <w:rPr>
-          <w:color w:val="374151"/>
-          <w:sz w:val="20"/>
-          <w:szCs w:val="20"/>
-        </w:rPr>
-        <w:t xml:space="preserve">Designed a secure, multi-tenant backend on Supabase with RLS, RESTful APIs, validation, and RBAC; integrated Plaid for bank data and a resilient EmailService with provider fallbacks; managed secrets via Infisical.</w:t>
-      </w:r>
-    </w:p>
-    <w:p>
-      <w:pPr>
-        <w:pStyle w:val="ListParagraph"/>
-        <w:numPr>
-          <w:ilvl w:val="0"/>
-          <w:numId w:val="2"/>
-        </w:numPr>
-        <w:spacing w:after="50"/>
-      </w:pPr>
-      <w:r>
-        <w:rPr>
-          <w:color w:val="374151"/>
-          <w:sz w:val="20"/>
-          <w:szCs w:val="20"/>
-        </w:rPr>
-        <w:t xml:space="preserve">Delivered AI-powered transaction categorization with human review and auditability; improved performance using Suspense, code splitting, and dynamic imports.</w:t>
-      </w:r>
-    </w:p>
-    <w:p>
-      <w:pPr>
-        <w:pStyle w:val="ListParagraph"/>
-        <w:numPr>
-          <w:ilvl w:val="0"/>
-          <w:numId w:val="2"/>
-        </w:numPr>
-        <w:spacing w:after="50"/>
-      </w:pPr>
-      <w:r>
-        <w:rPr>
-          <w:color w:val="374151"/>
-          <w:sz w:val="20"/>
-          <w:szCs w:val="20"/>
-        </w:rPr>
-        <w:t xml:space="preserve">Drove quality and reliability by refactoring large files into clean modules, adding comprehensive tests and monitoring, fixing bugs, and improving developer experience.</w:t>
+          <w:color w:val="2F54C8"/>
+          <w:sz w:val="20"/>
+          <w:szCs w:val="20"/>
+        </w:rPr>
+        <w:t xml:space="preserve">TrulyHome — Freelance / Client Build</w:t>
+      </w:r>
+    </w:p>
+    <w:p>
+      <w:pPr>
+        <w:pStyle w:val="ListParagraph"/>
+        <w:numPr>
+          <w:ilvl w:val="0"/>
+          <w:numId w:val="2"/>
+        </w:numPr>
+        <w:spacing w:after="50"/>
+      </w:pPr>
+      <w:r>
+        <w:rPr>
+          <w:color w:val="374151"/>
+          <w:sz w:val="20"/>
+          <w:szCs w:val="20"/>
+        </w:rPr>
+        <w:t xml:space="preserve">Single-handedly designed, built, and shipped TrulyHome—a multi-role logistics and project-management platform—to production in a 30-day build, onboarding 13 staff accounts on launch day.</w:t>
+      </w:r>
+    </w:p>
+    <w:p>
+      <w:pPr>
+        <w:pStyle w:val="ListParagraph"/>
+        <w:numPr>
+          <w:ilvl w:val="0"/>
+          <w:numId w:val="2"/>
+        </w:numPr>
+        <w:spacing w:after="50"/>
+      </w:pPr>
+      <w:r>
+        <w:rPr>
+          <w:color w:val="374151"/>
+          <w:sz w:val="20"/>
+          <w:szCs w:val="20"/>
+        </w:rPr>
+        <w:t xml:space="preserve">Architected a 5-role access model plus a public shipment-tracking surface on Next.js 16 (Server Components/Actions), React 19, and Supabase (Postgres 17, Realtime, RLS); hardened through two security red-team passes.</w:t>
+      </w:r>
+    </w:p>
+    <w:p>
+      <w:pPr>
+        <w:pStyle w:val="ListParagraph"/>
+        <w:numPr>
+          <w:ilvl w:val="0"/>
+          <w:numId w:val="2"/>
+        </w:numPr>
+        <w:spacing w:after="50"/>
+      </w:pPr>
+      <w:r>
+        <w:rPr>
+          <w:color w:val="374151"/>
+          <w:sz w:val="20"/>
+          <w:szCs w:val="20"/>
+        </w:rPr>
+        <w:t xml:space="preserve">Shipped a 7-stage pipeline with damage-triggered reprocessing, live freight tracking (ODFL, FedEx), EBOL PDF generation, native mobile (Capacitor 8, iOS/Android), and Playwright E2E across 3 device profiles.</w:t>
       </w:r>
     </w:p>
     <w:p>
@@ -525,7 +507,7 @@
           <w:sz w:val="23"/>
           <w:szCs w:val="23"/>
         </w:rPr>
-        <w:t xml:space="preserve">Full Stack Software Engineer</w:t>
+        <w:t xml:space="preserve">Lead Developer</w:t>
       </w:r>
       <w:r>
         <w:rPr>
@@ -533,7 +515,7 @@
           <w:sz w:val="19"/>
           <w:szCs w:val="19"/>
         </w:rPr>
-        <w:t xml:space="preserve">	April 2025 – January 2026</w:t>
+        <w:t xml:space="preserve">	April 2026 – June 2026</w:t>
       </w:r>
     </w:p>
     <w:p>
@@ -545,83 +527,65 @@
         <w:rPr>
           <w:b/>
           <w:bCs/>
-          <w:color w:val="1F3A5F"/>
-          <w:sz w:val="20"/>
-          <w:szCs w:val="20"/>
-        </w:rPr>
-        <w:t xml:space="preserve">Badge AI</w:t>
-      </w:r>
-    </w:p>
-    <w:p>
-      <w:pPr>
-        <w:pStyle w:val="ListParagraph"/>
-        <w:numPr>
-          <w:ilvl w:val="0"/>
-          <w:numId w:val="2"/>
-        </w:numPr>
-        <w:spacing w:after="50"/>
-      </w:pPr>
-      <w:r>
-        <w:rPr>
-          <w:color w:val="374151"/>
-          <w:sz w:val="20"/>
-          <w:szCs w:val="20"/>
-        </w:rPr>
-        <w:t xml:space="preserve">Architected and shipped the Badge Profile UI with TypeScript React (Vite), Wouter, Tailwind, and Shadcn/Radix—implementing profile sections, modals, QR previews, and fully responsive layouts.</w:t>
-      </w:r>
-    </w:p>
-    <w:p>
-      <w:pPr>
-        <w:pStyle w:val="ListParagraph"/>
-        <w:numPr>
-          <w:ilvl w:val="0"/>
-          <w:numId w:val="2"/>
-        </w:numPr>
-        <w:spacing w:after="50"/>
-      </w:pPr>
-      <w:r>
-        <w:rPr>
-          <w:color w:val="374151"/>
-          <w:sz w:val="20"/>
-          <w:szCs w:val="20"/>
-        </w:rPr>
-        <w:t xml:space="preserve">Built robust data/state layers using React Query and Zustand, added ProtectedRoute access control, and integrated OAuth/magic-link authentication with organization/role flows.</w:t>
-      </w:r>
-    </w:p>
-    <w:p>
-      <w:pPr>
-        <w:pStyle w:val="ListParagraph"/>
-        <w:numPr>
-          <w:ilvl w:val="0"/>
-          <w:numId w:val="2"/>
-        </w:numPr>
-        <w:spacing w:after="50"/>
-      </w:pPr>
-      <w:r>
-        <w:rPr>
-          <w:color w:val="374151"/>
-          <w:sz w:val="20"/>
-          <w:szCs w:val="20"/>
-        </w:rPr>
-        <w:t xml:space="preserve">Delivered AI and media features: headshot generation and chat, secure image uploads with DB-backed storage, and banner/branding tools—optimized via lazy-loading, code-splitting, and image best practices.</w:t>
-      </w:r>
-    </w:p>
-    <w:p>
-      <w:pPr>
-        <w:pStyle w:val="ListParagraph"/>
-        <w:numPr>
-          <w:ilvl w:val="0"/>
-          <w:numId w:val="2"/>
-        </w:numPr>
-        <w:spacing w:after="50"/>
-      </w:pPr>
-      <w:r>
-        <w:rPr>
-          <w:color w:val="374151"/>
-          <w:sz w:val="20"/>
-          <w:szCs w:val="20"/>
-        </w:rPr>
-        <w:t xml:space="preserve">Implemented backend routes and infra (profiles, chat, leads, settings), Stripe sandbox, and Drizzle migrations; improved quality with Jest/RTL tests, bug fixes, and performance tuning.</w:t>
+          <w:color w:val="2F54C8"/>
+          <w:sz w:val="20"/>
+          <w:szCs w:val="20"/>
+        </w:rPr>
+        <w:t xml:space="preserve">Zaptime</w:t>
+      </w:r>
+    </w:p>
+    <w:p>
+      <w:pPr>
+        <w:pStyle w:val="ListParagraph"/>
+        <w:numPr>
+          <w:ilvl w:val="0"/>
+          <w:numId w:val="2"/>
+        </w:numPr>
+        <w:spacing w:after="50"/>
+      </w:pPr>
+      <w:r>
+        <w:rPr>
+          <w:color w:val="374151"/>
+          <w:sz w:val="20"/>
+          <w:szCs w:val="20"/>
+        </w:rPr>
+        <w:t xml:space="preserve">Led development of Zaptime, a cross-device Electron time-tracking app with an AI assistant—authoring ~74% of the codebase (138 of 187 commits) and shipping 23 production Windows releases in ~2 months across a 6-person team.</w:t>
+      </w:r>
+    </w:p>
+    <w:p>
+      <w:pPr>
+        <w:pStyle w:val="ListParagraph"/>
+        <w:numPr>
+          <w:ilvl w:val="0"/>
+          <w:numId w:val="2"/>
+        </w:numPr>
+        <w:spacing w:after="50"/>
+      </w:pPr>
+      <w:r>
+        <w:rPr>
+          <w:color w:val="374151"/>
+          <w:sz w:val="20"/>
+          <w:szCs w:val="20"/>
+        </w:rPr>
+        <w:t xml:space="preserve">Executed a zero-downtime Firebase → Supabase migration via a dual-backend abstraction with an identical IPC contract, enabling safe rollback while active users kept syncing.</w:t>
+      </w:r>
+    </w:p>
+    <w:p>
+      <w:pPr>
+        <w:pStyle w:val="ListParagraph"/>
+        <w:numPr>
+          <w:ilvl w:val="0"/>
+          <w:numId w:val="2"/>
+        </w:numPr>
+        <w:spacing w:after="50"/>
+      </w:pPr>
+      <w:r>
+        <w:rPr>
+          <w:color w:val="374151"/>
+          <w:sz w:val="20"/>
+          <w:szCs w:val="20"/>
+        </w:rPr>
+        <w:t xml:space="preserve">Built a multi-provider AI assistant (OpenAI, OpenRouter, MiniMax) behind a table-driven abstraction with a deterministic activity-categorization engine, plus cross-device sync and a Node 18/20 GitHub Actions CI/CD pipeline (NSIS + Microsoft Store).</w:t>
       </w:r>
     </w:p>
     <w:p>
@@ -640,7 +604,7 @@
           <w:sz w:val="23"/>
           <w:szCs w:val="23"/>
         </w:rPr>
-        <w:t xml:space="preserve">Lead Full Stack Software Engineer</w:t>
+        <w:t xml:space="preserve">Full Stack Software Engineer</w:t>
       </w:r>
       <w:r>
         <w:rPr>
@@ -648,7 +612,7 @@
           <w:sz w:val="19"/>
           <w:szCs w:val="19"/>
         </w:rPr>
-        <w:t xml:space="preserve">	July 2023 – July 2025</w:t>
+        <w:t xml:space="preserve">	June 2025 – January 2026</w:t>
       </w:r>
     </w:p>
     <w:p>
@@ -660,83 +624,83 @@
         <w:rPr>
           <w:b/>
           <w:bCs/>
-          <w:color w:val="1F3A5F"/>
-          <w:sz w:val="20"/>
-          <w:szCs w:val="20"/>
-        </w:rPr>
-        <w:t xml:space="preserve">NarrativeTech</w:t>
-      </w:r>
-    </w:p>
-    <w:p>
-      <w:pPr>
-        <w:pStyle w:val="ListParagraph"/>
-        <w:numPr>
-          <w:ilvl w:val="0"/>
-          <w:numId w:val="2"/>
-        </w:numPr>
-        <w:spacing w:after="50"/>
-      </w:pPr>
-      <w:r>
-        <w:rPr>
-          <w:color w:val="374151"/>
-          <w:sz w:val="20"/>
-          <w:szCs w:val="20"/>
-        </w:rPr>
-        <w:t xml:space="preserve">Led the development and technical delivery of NarrativeTech platforms, taking ownership of architecture, implementation, and day-to-day execution across multiple client projects.</w:t>
-      </w:r>
-    </w:p>
-    <w:p>
-      <w:pPr>
-        <w:pStyle w:val="ListParagraph"/>
-        <w:numPr>
-          <w:ilvl w:val="0"/>
-          <w:numId w:val="2"/>
-        </w:numPr>
-        <w:spacing w:after="50"/>
-      </w:pPr>
-      <w:r>
-        <w:rPr>
-          <w:color w:val="374151"/>
-          <w:sz w:val="20"/>
-          <w:szCs w:val="20"/>
-        </w:rPr>
-        <w:t xml:space="preserve">Built and maintained full-stack applications using Next.js, Node.js, PostgreSQL, and Tailwind CSS, turning wireframes and product requirements into scalable, production-ready features.</w:t>
-      </w:r>
-    </w:p>
-    <w:p>
-      <w:pPr>
-        <w:pStyle w:val="ListParagraph"/>
-        <w:numPr>
-          <w:ilvl w:val="0"/>
-          <w:numId w:val="2"/>
-        </w:numPr>
-        <w:spacing w:after="50"/>
-      </w:pPr>
-      <w:r>
-        <w:rPr>
-          <w:color w:val="374151"/>
-          <w:sz w:val="20"/>
-          <w:szCs w:val="20"/>
-        </w:rPr>
-        <w:t xml:space="preserve">Implemented OpenAI agents and API integrations for document analysis and intelligent user assistance, improving workflow efficiency and overall user experience.</w:t>
-      </w:r>
-    </w:p>
-    <w:p>
-      <w:pPr>
-        <w:pStyle w:val="ListParagraph"/>
-        <w:numPr>
-          <w:ilvl w:val="0"/>
-          <w:numId w:val="2"/>
-        </w:numPr>
-        <w:spacing w:after="50"/>
-      </w:pPr>
-      <w:r>
-        <w:rPr>
-          <w:color w:val="374151"/>
-          <w:sz w:val="20"/>
-          <w:szCs w:val="20"/>
-        </w:rPr>
-        <w:t xml:space="preserve">Delivered a government portal from scratch and managed multiple subprojects in parallel, addressing client feedback, security requirements, and ongoing platform improvements while collaborating closely with UI/UX designers.</w:t>
+          <w:color w:val="2F54C8"/>
+          <w:sz w:val="20"/>
+          <w:szCs w:val="20"/>
+        </w:rPr>
+        <w:t xml:space="preserve">Switch</w:t>
+      </w:r>
+    </w:p>
+    <w:p>
+      <w:pPr>
+        <w:pStyle w:val="ListParagraph"/>
+        <w:numPr>
+          <w:ilvl w:val="0"/>
+          <w:numId w:val="2"/>
+        </w:numPr>
+        <w:spacing w:after="50"/>
+      </w:pPr>
+      <w:r>
+        <w:rPr>
+          <w:color w:val="374151"/>
+          <w:sz w:val="20"/>
+          <w:szCs w:val="20"/>
+        </w:rPr>
+        <w:t xml:space="preserve">Built responsive, accessible UIs with Next.js 15 (App Router), React/TypeScript, TailwindCSS, and Shadcn/UI—turning designs into reusable, consistent components.</w:t>
+      </w:r>
+    </w:p>
+    <w:p>
+      <w:pPr>
+        <w:pStyle w:val="ListParagraph"/>
+        <w:numPr>
+          <w:ilvl w:val="0"/>
+          <w:numId w:val="2"/>
+        </w:numPr>
+        <w:spacing w:after="50"/>
+      </w:pPr>
+      <w:r>
+        <w:rPr>
+          <w:color w:val="374151"/>
+          <w:sz w:val="20"/>
+          <w:szCs w:val="20"/>
+        </w:rPr>
+        <w:t xml:space="preserve">Designed a secure, multi-tenant backend on Supabase with RLS, RESTful APIs, validation, and RBAC; integrated Plaid for bank data and a resilient EmailService with provider fallbacks; managed secrets via Infisical.</w:t>
+      </w:r>
+    </w:p>
+    <w:p>
+      <w:pPr>
+        <w:pStyle w:val="ListParagraph"/>
+        <w:numPr>
+          <w:ilvl w:val="0"/>
+          <w:numId w:val="2"/>
+        </w:numPr>
+        <w:spacing w:after="50"/>
+      </w:pPr>
+      <w:r>
+        <w:rPr>
+          <w:color w:val="374151"/>
+          <w:sz w:val="20"/>
+          <w:szCs w:val="20"/>
+        </w:rPr>
+        <w:t xml:space="preserve">Delivered AI-powered transaction categorization with human review and auditability; improved performance using Suspense, code splitting, and dynamic imports.</w:t>
+      </w:r>
+    </w:p>
+    <w:p>
+      <w:pPr>
+        <w:pStyle w:val="ListParagraph"/>
+        <w:numPr>
+          <w:ilvl w:val="0"/>
+          <w:numId w:val="2"/>
+        </w:numPr>
+        <w:spacing w:after="50"/>
+      </w:pPr>
+      <w:r>
+        <w:rPr>
+          <w:color w:val="374151"/>
+          <w:sz w:val="20"/>
+          <w:szCs w:val="20"/>
+        </w:rPr>
+        <w:t xml:space="preserve">Drove quality and reliability by refactoring large files into clean modules, adding comprehensive tests and monitoring, fixing bugs, and improving developer experience.</w:t>
       </w:r>
     </w:p>
     <w:p>
@@ -755,7 +719,7 @@
           <w:sz w:val="23"/>
           <w:szCs w:val="23"/>
         </w:rPr>
-        <w:t xml:space="preserve">Frontend Software Engineer</w:t>
+        <w:t xml:space="preserve">Full Stack Software Engineer</w:t>
       </w:r>
       <w:r>
         <w:rPr>
@@ -763,7 +727,7 @@
           <w:sz w:val="19"/>
           <w:szCs w:val="19"/>
         </w:rPr>
-        <w:t xml:space="preserve">	July 2024 – February 2025</w:t>
+        <w:t xml:space="preserve">	April 2025 – January 2026</w:t>
       </w:r>
     </w:p>
     <w:p>
@@ -775,83 +739,83 @@
         <w:rPr>
           <w:b/>
           <w:bCs/>
-          <w:color w:val="1F3A5F"/>
-          <w:sz w:val="20"/>
-          <w:szCs w:val="20"/>
-        </w:rPr>
-        <w:t xml:space="preserve">Ariolas Tech</w:t>
-      </w:r>
-    </w:p>
-    <w:p>
-      <w:pPr>
-        <w:pStyle w:val="ListParagraph"/>
-        <w:numPr>
-          <w:ilvl w:val="0"/>
-          <w:numId w:val="2"/>
-        </w:numPr>
-        <w:spacing w:after="50"/>
-      </w:pPr>
-      <w:r>
-        <w:rPr>
-          <w:color w:val="374151"/>
-          <w:sz w:val="20"/>
-          <w:szCs w:val="20"/>
-        </w:rPr>
-        <w:t xml:space="preserve">Developed responsive front-end applications with Next.js, React, and Tailwind CSS, transforming wireframes and design specifications into intuitive, user-friendly interfaces.</w:t>
-      </w:r>
-    </w:p>
-    <w:p>
-      <w:pPr>
-        <w:pStyle w:val="ListParagraph"/>
-        <w:numPr>
-          <w:ilvl w:val="0"/>
-          <w:numId w:val="2"/>
-        </w:numPr>
-        <w:spacing w:after="50"/>
-      </w:pPr>
-      <w:r>
-        <w:rPr>
-          <w:color w:val="374151"/>
-          <w:sz w:val="20"/>
-          <w:szCs w:val="20"/>
-        </w:rPr>
-        <w:t xml:space="preserve">Implemented AI technologies across multiple projects, delivering innovative solutions that enhanced product capabilities and improved user experience.</w:t>
-      </w:r>
-    </w:p>
-    <w:p>
-      <w:pPr>
-        <w:pStyle w:val="ListParagraph"/>
-        <w:numPr>
-          <w:ilvl w:val="0"/>
-          <w:numId w:val="2"/>
-        </w:numPr>
-        <w:spacing w:after="50"/>
-      </w:pPr>
-      <w:r>
-        <w:rPr>
-          <w:color w:val="374151"/>
-          <w:sz w:val="20"/>
-          <w:szCs w:val="20"/>
-        </w:rPr>
-        <w:t xml:space="preserve">Built robust backend systems using Supabase, and Infisical for secure environment management, creating scalable and maintainable application architecture.</w:t>
-      </w:r>
-    </w:p>
-    <w:p>
-      <w:pPr>
-        <w:pStyle w:val="ListParagraph"/>
-        <w:numPr>
-          <w:ilvl w:val="0"/>
-          <w:numId w:val="2"/>
-        </w:numPr>
-        <w:spacing w:after="50"/>
-      </w:pPr>
-      <w:r>
-        <w:rPr>
-          <w:color w:val="374151"/>
-          <w:sz w:val="20"/>
-          <w:szCs w:val="20"/>
-        </w:rPr>
-        <w:t xml:space="preserve">Led continuous codebase improvements by resolving bugs, optimizing performance, and implementing modern development practices to ensure high-quality deliverables.</w:t>
+          <w:color w:val="2F54C8"/>
+          <w:sz w:val="20"/>
+          <w:szCs w:val="20"/>
+        </w:rPr>
+        <w:t xml:space="preserve">Badge AI</w:t>
+      </w:r>
+    </w:p>
+    <w:p>
+      <w:pPr>
+        <w:pStyle w:val="ListParagraph"/>
+        <w:numPr>
+          <w:ilvl w:val="0"/>
+          <w:numId w:val="2"/>
+        </w:numPr>
+        <w:spacing w:after="50"/>
+      </w:pPr>
+      <w:r>
+        <w:rPr>
+          <w:color w:val="374151"/>
+          <w:sz w:val="20"/>
+          <w:szCs w:val="20"/>
+        </w:rPr>
+        <w:t xml:space="preserve">Architected and shipped the Badge Profile UI with TypeScript React (Vite), Wouter, Tailwind, and Shadcn/Radix—implementing profile sections, modals, QR previews, and fully responsive layouts.</w:t>
+      </w:r>
+    </w:p>
+    <w:p>
+      <w:pPr>
+        <w:pStyle w:val="ListParagraph"/>
+        <w:numPr>
+          <w:ilvl w:val="0"/>
+          <w:numId w:val="2"/>
+        </w:numPr>
+        <w:spacing w:after="50"/>
+      </w:pPr>
+      <w:r>
+        <w:rPr>
+          <w:color w:val="374151"/>
+          <w:sz w:val="20"/>
+          <w:szCs w:val="20"/>
+        </w:rPr>
+        <w:t xml:space="preserve">Built robust data/state layers using React Query and Zustand, added ProtectedRoute access control, and integrated OAuth/magic-link authentication with organization/role flows.</w:t>
+      </w:r>
+    </w:p>
+    <w:p>
+      <w:pPr>
+        <w:pStyle w:val="ListParagraph"/>
+        <w:numPr>
+          <w:ilvl w:val="0"/>
+          <w:numId w:val="2"/>
+        </w:numPr>
+        <w:spacing w:after="50"/>
+      </w:pPr>
+      <w:r>
+        <w:rPr>
+          <w:color w:val="374151"/>
+          <w:sz w:val="20"/>
+          <w:szCs w:val="20"/>
+        </w:rPr>
+        <w:t xml:space="preserve">Delivered AI and media features: headshot generation and chat, secure image uploads with DB-backed storage, and banner/branding tools—optimized via lazy-loading, code-splitting, and image best practices.</w:t>
+      </w:r>
+    </w:p>
+    <w:p>
+      <w:pPr>
+        <w:pStyle w:val="ListParagraph"/>
+        <w:numPr>
+          <w:ilvl w:val="0"/>
+          <w:numId w:val="2"/>
+        </w:numPr>
+        <w:spacing w:after="50"/>
+      </w:pPr>
+      <w:r>
+        <w:rPr>
+          <w:color w:val="374151"/>
+          <w:sz w:val="20"/>
+          <w:szCs w:val="20"/>
+        </w:rPr>
+        <w:t xml:space="preserve">Implemented backend routes and infra (profiles, chat, leads, settings), Stripe sandbox, and Drizzle migrations; improved quality with Jest/RTL tests, bug fixes, and performance tuning.</w:t>
       </w:r>
     </w:p>
     <w:p>
@@ -870,7 +834,7 @@
           <w:sz w:val="23"/>
           <w:szCs w:val="23"/>
         </w:rPr>
-        <w:t xml:space="preserve">Full Stack Software Engineer</w:t>
+        <w:t xml:space="preserve">Lead Full Stack Software Engineer</w:t>
       </w:r>
       <w:r>
         <w:rPr>
@@ -878,6 +842,218 @@
           <w:sz w:val="19"/>
           <w:szCs w:val="19"/>
         </w:rPr>
+        <w:t xml:space="preserve">	July 2023 – July 2025</w:t>
+      </w:r>
+    </w:p>
+    <w:p>
+      <w:pPr>
+        <w:keepNext/>
+        <w:spacing w:after="80" w:before="0"/>
+      </w:pPr>
+      <w:r>
+        <w:rPr>
+          <w:b/>
+          <w:bCs/>
+          <w:color w:val="2F54C8"/>
+          <w:sz w:val="20"/>
+          <w:szCs w:val="20"/>
+        </w:rPr>
+        <w:t xml:space="preserve">NarrativeTech</w:t>
+      </w:r>
+    </w:p>
+    <w:p>
+      <w:pPr>
+        <w:pStyle w:val="ListParagraph"/>
+        <w:numPr>
+          <w:ilvl w:val="0"/>
+          <w:numId w:val="2"/>
+        </w:numPr>
+        <w:spacing w:after="50"/>
+      </w:pPr>
+      <w:r>
+        <w:rPr>
+          <w:color w:val="374151"/>
+          <w:sz w:val="20"/>
+          <w:szCs w:val="20"/>
+        </w:rPr>
+        <w:t xml:space="preserve">Led the development and technical delivery of NarrativeTech platforms, taking ownership of architecture, implementation, and day-to-day execution across multiple client projects.</w:t>
+      </w:r>
+    </w:p>
+    <w:p>
+      <w:pPr>
+        <w:pStyle w:val="ListParagraph"/>
+        <w:numPr>
+          <w:ilvl w:val="0"/>
+          <w:numId w:val="2"/>
+        </w:numPr>
+        <w:spacing w:after="50"/>
+      </w:pPr>
+      <w:r>
+        <w:rPr>
+          <w:color w:val="374151"/>
+          <w:sz w:val="20"/>
+          <w:szCs w:val="20"/>
+        </w:rPr>
+        <w:t xml:space="preserve">Built and maintained full-stack applications using Next.js, Node.js, PostgreSQL, and Tailwind CSS, turning wireframes and product requirements into scalable, production-ready features.</w:t>
+      </w:r>
+    </w:p>
+    <w:p>
+      <w:pPr>
+        <w:pStyle w:val="ListParagraph"/>
+        <w:numPr>
+          <w:ilvl w:val="0"/>
+          <w:numId w:val="2"/>
+        </w:numPr>
+        <w:spacing w:after="50"/>
+      </w:pPr>
+      <w:r>
+        <w:rPr>
+          <w:color w:val="374151"/>
+          <w:sz w:val="20"/>
+          <w:szCs w:val="20"/>
+        </w:rPr>
+        <w:t xml:space="preserve">Implemented OpenAI agents and API integrations for document analysis and intelligent user assistance, improving workflow efficiency and overall user experience.</w:t>
+      </w:r>
+    </w:p>
+    <w:p>
+      <w:pPr>
+        <w:pStyle w:val="ListParagraph"/>
+        <w:numPr>
+          <w:ilvl w:val="0"/>
+          <w:numId w:val="2"/>
+        </w:numPr>
+        <w:spacing w:after="50"/>
+      </w:pPr>
+      <w:r>
+        <w:rPr>
+          <w:color w:val="374151"/>
+          <w:sz w:val="20"/>
+          <w:szCs w:val="20"/>
+        </w:rPr>
+        <w:t xml:space="preserve">Delivered a government portal from scratch and managed multiple subprojects in parallel, addressing client feedback, security requirements, and ongoing platform improvements while collaborating closely with UI/UX designers.</w:t>
+      </w:r>
+    </w:p>
+    <w:p>
+      <w:pPr>
+        <w:keepNext/>
+        <w:tabs>
+          <w:tab w:val="right" w:pos="10318"/>
+        </w:tabs>
+        <w:spacing w:after="0" w:before="180"/>
+      </w:pPr>
+      <w:r>
+        <w:rPr>
+          <w:b/>
+          <w:bCs/>
+          <w:color w:val="111827"/>
+          <w:sz w:val="23"/>
+          <w:szCs w:val="23"/>
+        </w:rPr>
+        <w:t xml:space="preserve">Frontend Software Engineer</w:t>
+      </w:r>
+      <w:r>
+        <w:rPr>
+          <w:color w:val="6B7280"/>
+          <w:sz w:val="19"/>
+          <w:szCs w:val="19"/>
+        </w:rPr>
+        <w:t xml:space="preserve">	July 2024 – February 2025</w:t>
+      </w:r>
+    </w:p>
+    <w:p>
+      <w:pPr>
+        <w:keepNext/>
+        <w:spacing w:after="80" w:before="0"/>
+      </w:pPr>
+      <w:r>
+        <w:rPr>
+          <w:b/>
+          <w:bCs/>
+          <w:color w:val="2F54C8"/>
+          <w:sz w:val="20"/>
+          <w:szCs w:val="20"/>
+        </w:rPr>
+        <w:t xml:space="preserve">Ariolas Tech</w:t>
+      </w:r>
+    </w:p>
+    <w:p>
+      <w:pPr>
+        <w:pStyle w:val="ListParagraph"/>
+        <w:numPr>
+          <w:ilvl w:val="0"/>
+          <w:numId w:val="2"/>
+        </w:numPr>
+        <w:spacing w:after="50"/>
+      </w:pPr>
+      <w:r>
+        <w:rPr>
+          <w:color w:val="374151"/>
+          <w:sz w:val="20"/>
+          <w:szCs w:val="20"/>
+        </w:rPr>
+        <w:t xml:space="preserve">Developed responsive front-end applications with Next.js, React, and Tailwind CSS, transforming wireframes and design specifications into intuitive, user-friendly interfaces.</w:t>
+      </w:r>
+    </w:p>
+    <w:p>
+      <w:pPr>
+        <w:pStyle w:val="ListParagraph"/>
+        <w:numPr>
+          <w:ilvl w:val="0"/>
+          <w:numId w:val="2"/>
+        </w:numPr>
+        <w:spacing w:after="50"/>
+      </w:pPr>
+      <w:r>
+        <w:rPr>
+          <w:color w:val="374151"/>
+          <w:sz w:val="20"/>
+          <w:szCs w:val="20"/>
+        </w:rPr>
+        <w:t xml:space="preserve">Implemented AI technologies across multiple projects, delivering innovative solutions that enhanced product capabilities and improved user experience.</w:t>
+      </w:r>
+    </w:p>
+    <w:p>
+      <w:pPr>
+        <w:pStyle w:val="ListParagraph"/>
+        <w:numPr>
+          <w:ilvl w:val="0"/>
+          <w:numId w:val="2"/>
+        </w:numPr>
+        <w:spacing w:after="50"/>
+      </w:pPr>
+      <w:r>
+        <w:rPr>
+          <w:color w:val="374151"/>
+          <w:sz w:val="20"/>
+          <w:szCs w:val="20"/>
+        </w:rPr>
+        <w:t xml:space="preserve">Built robust backend systems using Supabase, and Infisical for secure environment management, creating scalable and maintainable application architecture.</w:t>
+      </w:r>
+    </w:p>
+    <w:p>
+      <w:pPr>
+        <w:keepNext/>
+        <w:tabs>
+          <w:tab w:val="right" w:pos="10318"/>
+        </w:tabs>
+        <w:spacing w:after="0" w:before="180"/>
+      </w:pPr>
+      <w:r>
+        <w:rPr>
+          <w:b/>
+          <w:bCs/>
+          <w:color w:val="111827"/>
+          <w:sz w:val="23"/>
+          <w:szCs w:val="23"/>
+        </w:rPr>
+        <w:t xml:space="preserve">Full Stack Software Engineer</w:t>
+      </w:r>
+      <w:r>
+        <w:rPr>
+          <w:color w:val="6B7280"/>
+          <w:sz w:val="19"/>
+          <w:szCs w:val="19"/>
+        </w:rPr>
         <w:t xml:space="preserve">	May 2023 – September 2023</w:t>
       </w:r>
     </w:p>
@@ -890,7 +1066,7 @@
         <w:rPr>
           <w:b/>
           <w:bCs/>
-          <w:color w:val="1F3A5F"/>
+          <w:color w:val="2F54C8"/>
           <w:sz w:val="20"/>
           <w:szCs w:val="20"/>
         </w:rPr>
@@ -946,7 +1122,7 @@
           <w:b/>
           <w:bCs/>
           <w:caps/>
-          <w:color w:val="1F3A5F"/>
+          <w:color w:val="2F54C8"/>
           <w:spacing w:val="32"/>
           <w:sz w:val="22"/>
           <w:szCs w:val="22"/>
@@ -989,7 +1165,7 @@
         <w:rPr>
           <w:b/>
           <w:bCs/>
-          <w:color w:val="1F3A5F"/>
+          <w:color w:val="2F54C8"/>
           <w:sz w:val="20"/>
           <w:szCs w:val="20"/>
         </w:rPr>
@@ -1031,7 +1207,7 @@
         <w:rPr>
           <w:b/>
           <w:bCs/>
-          <w:color w:val="1F3A5F"/>
+          <w:color w:val="2F54C8"/>
           <w:sz w:val="20"/>
           <w:szCs w:val="20"/>
         </w:rPr>
@@ -1051,7 +1227,7 @@
           <w:b/>
           <w:bCs/>
           <w:caps/>
-          <w:color w:val="1F3A5F"/>
+          <w:color w:val="2F54C8"/>
           <w:spacing w:val="32"/>
           <w:sz w:val="22"/>
           <w:szCs w:val="22"/>

</xml_diff>